<commit_message>
Correção dos documentos da Sprint
</commit_message>
<xml_diff>
--- a/Sprint Retrospective - Brahyan Dias.docx
+++ b/Sprint Retrospective - Brahyan Dias.docx
@@ -173,7 +173,7 @@
         <w:rPr>
           <w:rtl w:val="0"/>
         </w:rPr>
-        <w:t xml:space="preserve">Dificuldade inicial para utilizar os comandos do Git pelo Prompt de Comando.</w:t>
+        <w:t xml:space="preserve">Dificuldade inicial para aprender os comandos e utilizá-lós da maneira correta.</w:t>
       </w:r>
     </w:p>
     <w:p>
@@ -198,24 +198,24 @@
         <w:keepNext w:val="0"/>
         <w:keepLines w:val="0"/>
         <w:spacing w:after="80" w:lineRule="auto"/>
+        <w:rPr/>
+      </w:pPr>
+      <w:bookmarkStart w:colFirst="0" w:colLast="0" w:name="_5fl5vyiwi7kh" w:id="3"/>
+      <w:bookmarkEnd w:id="3"/>
+      <w:r>
         <w:rPr>
           <w:b w:val="1"/>
           <w:bCs w:val="1"/>
           <w:sz w:val="34"/>
           <w:szCs w:val="34"/>
-        </w:rPr>
-      </w:pPr>
-      <w:bookmarkStart w:colFirst="0" w:colLast="0" w:name="_5fl5vyiwi7kh" w:id="3"/>
-      <w:bookmarkEnd w:id="3"/>
-      <w:r>
-        <w:rPr>
-          <w:b w:val="1"/>
-          <w:bCs w:val="1"/>
-          <w:sz w:val="34"/>
-          <w:szCs w:val="34"/>
           <w:rtl w:val="0"/>
         </w:rPr>
         <w:t xml:space="preserve">Sugestões de melhoria</w:t>
+      </w:r>
+      <w:r>
+        <w:rPr>
+          <w:rtl w:val="0"/>
+        </w:rPr>
       </w:r>
     </w:p>
     <w:p>
@@ -225,22 +225,6 @@
           <w:numId w:val="1"/>
         </w:numPr>
         <w:spacing w:after="0" w:afterAutospacing="0" w:before="240" w:lineRule="auto"/>
-        <w:ind w:left="720" w:hanging="360"/>
-      </w:pPr>
-      <w:r>
-        <w:rPr>
-          <w:rtl w:val="0"/>
-        </w:rPr>
-        <w:t xml:space="preserve">Planejar as tarefas antes de iniciar a Sprint.</w:t>
-      </w:r>
-    </w:p>
-    <w:p>
-      <w:pPr>
-        <w:numPr>
-          <w:ilvl w:val="0"/>
-          <w:numId w:val="1"/>
-        </w:numPr>
-        <w:spacing w:after="0" w:afterAutospacing="0" w:before="0" w:beforeAutospacing="0" w:lineRule="auto"/>
         <w:ind w:left="720" w:hanging="360"/>
       </w:pPr>
       <w:r>

</xml_diff>